<commit_message>
SOW: Cientista de Dados na W4-W5; Eng. de ML entrega projecao de consumo e runbook
Co-Authored-By: Claude Sonnet 5.5 <noreply@anthropic.com>
</commit_message>
<xml_diff>
--- a/sow/3coracoes PoC Recomendacao de SKU Personalize - SoW - 29102026 v1 - EN.docx
+++ b/sow/3coracoes PoC Recomendacao de SKU Personalize - SoW - 29102026 v1 - EN.docx
@@ -1286,7 +1286,7 @@
           <w:szCs w:val="21"/>
           <w:rtl w:val="0"/>
         </w:rPr>
-        <w:t>The PoC will be delivered in 7 weeks, from kickoff (W0) to W6, in four phases, with weekly checkpoints with the 3corações team. Acceptance tests of NBO and basket run in W1 so that the go/no-go per mechanic is taken early; A/B campaigns are launched in W4 to W6, with a first directional read at the end of the PoC. The A3Data team is a Project Leader for the whole project (W0 to W6), a Data Architect in the first two weeks (W0 to W1), a Machine Learning Engineer for six weeks (W1 to W6) and a Data Scientist for two weeks of effort distributed over W0 to W6 (success criteria, acceptance tests, offline evaluation and A/B read).</w:t>
+        <w:t>The PoC will be delivered in 7 weeks, from kickoff (W0) to W6, in four phases, with weekly checkpoints with the 3corações team. Acceptance tests of NBO and basket run in W1 so that the go/no-go per mechanic is taken early; A/B campaigns are launched in W4 to W6, with a first directional read at the end of the PoC. The A3Data team is a Project Leader for the whole project (W0 to W6), a Data Architect in the first two weeks (W0 to W1), a Machine Learning Engineer for six weeks (W1 to W6), who also delivers the consumption projection, the runbook and the handover session in W6, and a Data Scientist for two weeks (W4 to W5) for the offline evaluation and the A/B read.</w:t>
       </w:r>
       <w:r>
         <w:rPr>
@@ -5104,7 +5104,7 @@
                 <w:szCs w:val="19"/>
                 <w:rtl w:val="0"/>
               </w:rPr>
-              <w:t>Data Scientist (2 weeks of effort, distributed over W0 to W6)</w:t>
+              <w:t>Data Scientist (2 weeks, W4 to W5)</w:t>
             </w:r>
             <w:r>
               <w:rPr>

</xml_diff>

<commit_message>
SOW: link e print da calculadora AWS (estimativa de US$ 9.041,74/mes); arquivos exportados da calculadora
Co-Authored-By: Claude Sonnet 5.5 <noreply@anthropic.com>
</commit_message>
<xml_diff>
--- a/sow/3coracoes PoC Recomendacao de SKU Personalize - SoW - 29102026 v1 - EN.docx
+++ b/sow/3coracoes PoC Recomendacao de SKU Personalize - SoW - 29102026 v1 - EN.docx
@@ -4440,7 +4440,7 @@
           <w:szCs w:val="21"/>
           <w:rtl w:val="0"/>
         </w:rPr>
-        <w:t xml:space="preserve"> &lt;link aws calculator&gt;</w:t>
+        <w:t xml:space="preserve"> https://calculator.aws/#/estimate?id=0edcebcbffa366d21ee795fea937e496d455c230</w:t>
       </w:r>
       <w:r>
         <w:rPr>
@@ -4466,7 +4466,38 @@
           <w:szCs w:val="21"/>
           <w:rtl w:val="0"/>
         </w:rPr>
-        <w:t xml:space="preserve">&lt;Print of ARR of calculator&gt;</w:t>
+        <w:drawing>
+          <wp:inline>
+            <wp:extent cx="5303520" cy="1552350"/>
+            <wp:docPr id="2" name="Picture 2"/>
+            <wp:cNvGraphicFramePr>
+              <a:graphicFrameLocks noChangeAspect="1"/>
+            </wp:cNvGraphicFramePr>
+            <a:graphic>
+              <a:graphicData uri="http://schemas.openxmlformats.org/drawingml/2006/picture">
+                <pic:pic>
+                  <pic:nvPicPr>
+                    <pic:cNvPr id="0" name="print-arr-calculadora.png"/>
+                    <pic:cNvPicPr/>
+                  </pic:nvPicPr>
+                  <pic:blipFill>
+                    <a:blip r:embed="rId9"/>
+                    <a:stretch>
+                      <a:fillRect/>
+                    </a:stretch>
+                  </pic:blipFill>
+                  <pic:spPr>
+                    <a:xfrm>
+                      <a:off x="0" y="0"/>
+                      <a:ext cx="5303520" cy="1552350"/>
+                    </a:xfrm>
+                    <a:prstGeom prst="rect"/>
+                  </pic:spPr>
+                </pic:pic>
+              </a:graphicData>
+            </a:graphic>
+          </wp:inline>
+        </w:drawing>
       </w:r>
     </w:p>
     <w:p>

</xml_diff>

<commit_message>
SOW: print do ARR com resumo e lista de servicos da calculadora
Co-Authored-By: Claude Sonnet 5.5 <noreply@anthropic.com>
</commit_message>
<xml_diff>
--- a/sow/3coracoes PoC Recomendacao de SKU Personalize - SoW - 29102026 v1 - EN.docx
+++ b/sow/3coracoes PoC Recomendacao de SKU Personalize - SoW - 29102026 v1 - EN.docx
@@ -4468,7 +4468,7 @@
         </w:rPr>
         <w:drawing>
           <wp:inline>
-            <wp:extent cx="5303520" cy="1552350"/>
+            <wp:extent cx="5760720" cy="5242255"/>
             <wp:docPr id="2" name="Picture 2"/>
             <wp:cNvGraphicFramePr>
               <a:graphicFrameLocks noChangeAspect="1"/>
@@ -4489,7 +4489,7 @@
                   <pic:spPr>
                     <a:xfrm>
                       <a:off x="0" y="0"/>
-                      <a:ext cx="5303520" cy="1552350"/>
+                      <a:ext cx="5760720" cy="5242255"/>
                     </a:xfrm>
                     <a:prstGeom prst="rect"/>
                   </pic:spPr>

</xml_diff>